<commit_message>
Restaurar pruebas y documentar evidencia CI
</commit_message>
<xml_diff>
--- a/docs/Integracion continua entrega final.docx
+++ b/docs/Integracion continua entrega final.docx
@@ -16,7 +16,7 @@
           <w:color w:val="1558A0"/>
           <w:sz w:val="28"/>
         </w:rPr>
-        <w:t>Integracion continua entrega final</w:t>
+        <w:t>Integración continua entrega final</w:t>
       </w:r>
     </w:p>
     <w:p>
@@ -32,7 +32,7 @@
           <w:color w:val="586069"/>
           <w:sz w:val="19"/>
         </w:rPr>
-        <w:t>Entrega 3 - Pipeline de Integracion Continua con GitHub Actions</w:t>
+        <w:t>Entrega 3 - Pipeline de Integración Continua con GitHub Actions</w:t>
       </w:r>
     </w:p>
     <w:tbl>
@@ -154,7 +154,7 @@
                 <w:color w:val="141E2D"/>
                 <w:sz w:val="16"/>
               </w:rPr>
-              <w:t>Enfasis Profesional II - Integracion Continua (codigo 2711)</w:t>
+              <w:t>Énfasis Profesional II - Integración Continua (código 2711)</w:t>
             </w:r>
           </w:p>
         </w:tc>
@@ -211,7 +211,7 @@
                 <w:color w:val="141E2D"/>
                 <w:sz w:val="16"/>
               </w:rPr>
-              <w:t>Entrega 3 - Pipeline de Integracion Continua con GitHub Actions</w:t>
+              <w:t>Entrega 3 - Pipeline de Integración Continua con GitHub Actions</w:t>
             </w:r>
           </w:p>
         </w:tc>
@@ -268,7 +268,7 @@
                 <w:color w:val="141E2D"/>
                 <w:sz w:val="16"/>
               </w:rPr>
-              <w:t>Samir Yardany Pena Rocha</w:t>
+              <w:t>Samir Yardany Peña Rocha</w:t>
             </w:r>
           </w:p>
         </w:tc>
@@ -478,7 +478,7 @@
           <w:color w:val="141E2D"/>
           <w:sz w:val="18"/>
         </w:rPr>
-        <w:t>La integracion continua es una practica de desarrollo en la que cada cambio subido al repositorio activa validaciones automaticas como instalacion de dependencias, pruebas y compilacion. Sirve para detectar errores temprano, evitar que codigo defectuoso llegue a la rama principal y demostrar que el proyecto sigue funcionando despues de cada actualizacion.</w:t>
+        <w:t>La integración continua es una práctica de desarrollo en la que cada cambio subido al repositorio activa validaciones automáticas como instalación de dependencias, pruebas y compilación. Sirve para detectar errores temprano, evitar que código defectuoso llegue a la rama principal y demostrar que el proyecto sigue funcionando después de cada actualización.</w:t>
       </w:r>
     </w:p>
     <w:p>
@@ -558,7 +558,7 @@
                 <w:color w:val="1558A0"/>
                 <w:sz w:val="15"/>
               </w:rPr>
-              <w:t>Funcion dentro de la integracion continua</w:t>
+              <w:t>Función dentro de la integración continua</w:t>
             </w:r>
           </w:p>
         </w:tc>
@@ -612,7 +612,7 @@
                 <w:color w:val="141E2D"/>
                 <w:sz w:val="14"/>
               </w:rPr>
-              <w:t>Identifica el flujo en la pestana Actions para que el evaluador ubique la ejecucion.</w:t>
+              <w:t>Identifica el flujo en la pestaña Actions para que el evaluador ubique la ejecución.</w:t>
             </w:r>
           </w:p>
         </w:tc>
@@ -666,7 +666,7 @@
                 <w:color w:val="141E2D"/>
                 <w:sz w:val="14"/>
               </w:rPr>
-              <w:t>Ejecuta el pipeline automaticamente cada vez que se sube un cambio o se abre un pull request hacia main.</w:t>
+              <w:t>Ejecuta el pipeline automáticamente cada vez que se sube un cambio o se abre un pull request hacia main.</w:t>
             </w:r>
           </w:p>
         </w:tc>
@@ -774,7 +774,7 @@
                 <w:color w:val="141E2D"/>
                 <w:sz w:val="14"/>
               </w:rPr>
-              <w:t>Descarga el codigo del repositorio dentro del runner.</w:t>
+              <w:t>Descarga el código del repositorio dentro del runner.</w:t>
             </w:r>
           </w:p>
         </w:tc>
@@ -828,7 +828,7 @@
                 <w:color w:val="141E2D"/>
                 <w:sz w:val="14"/>
               </w:rPr>
-              <w:t>Instala Node.js 20 y habilita cache de npm para dependencias.</w:t>
+              <w:t>Instala Node.js 20 y habilita caché de npm para dependencias.</w:t>
             </w:r>
           </w:p>
         </w:tc>
@@ -882,7 +882,7 @@
                 <w:color w:val="141E2D"/>
                 <w:sz w:val="14"/>
               </w:rPr>
-              <w:t>Instala dependencias exactamente segun package-lock.json.</w:t>
+              <w:t>Instala dependencias exactamente según package-lock.json.</w:t>
             </w:r>
           </w:p>
         </w:tc>
@@ -1117,23 +1117,43 @@
           <w:color w:val="1C784A"/>
           <w:sz w:val="19"/>
         </w:rPr>
-        <w:t>Figura 1. Ejecucion exitosa del flujo (build verde)</w:t>
+        <w:t>Figura 1. Ejecución exitosa del flujo (build verde)</w:t>
       </w:r>
     </w:p>
     <w:p>
-      <w:pPr>
-        <w:spacing w:before="0" w:after="40" w:line="240" w:lineRule="auto"/>
-        <w:jc w:val="center"/>
-      </w:pPr>
       <w:r>
-        <w:rPr>
-          <w:rFonts w:ascii="Times New Roman" w:hAnsi="Times New Roman"/>
-          <w:b w:val="0"/>
-          <w:i/>
-          <w:color w:val="A63030"/>
-          <w:sz w:val="19"/>
-        </w:rPr>
-        <w:t>Pendiente insertar captura: github_actions_success.png</w:t>
+        <w:drawing>
+          <wp:inline xmlns:a="http://schemas.openxmlformats.org/drawingml/2006/main" xmlns:pic="http://schemas.openxmlformats.org/drawingml/2006/picture">
+            <wp:extent cx="6172200" cy="4254671"/>
+            <wp:docPr id="1" name="Picture 1"/>
+            <wp:cNvGraphicFramePr>
+              <a:graphicFrameLocks noChangeAspect="1"/>
+            </wp:cNvGraphicFramePr>
+            <a:graphic>
+              <a:graphicData uri="http://schemas.openxmlformats.org/drawingml/2006/picture">
+                <pic:pic>
+                  <pic:nvPicPr>
+                    <pic:cNvPr id="0" name="github_actions_success.png"/>
+                    <pic:cNvPicPr/>
+                  </pic:nvPicPr>
+                  <pic:blipFill>
+                    <a:blip r:embed="rId9"/>
+                    <a:stretch>
+                      <a:fillRect/>
+                    </a:stretch>
+                  </pic:blipFill>
+                  <pic:spPr>
+                    <a:xfrm>
+                      <a:off x="0" y="0"/>
+                      <a:ext cx="6172200" cy="4254671"/>
+                    </a:xfrm>
+                    <a:prstGeom prst="rect"/>
+                  </pic:spPr>
+                </pic:pic>
+              </a:graphicData>
+            </a:graphic>
+          </wp:inline>
+        </w:drawing>
       </w:r>
     </w:p>
     <w:p>
@@ -1148,7 +1168,7 @@
           <w:color w:val="586069"/>
           <w:sz w:val="16"/>
         </w:rPr>
-        <w:t>Nota. Las pruebas automatizadas pasaron y el workflow finalizo correctamente.</w:t>
+        <w:t>Nota. Las pruebas automatizadas pasaron y el workflow finalizó correctamente.</w:t>
       </w:r>
     </w:p>
     <w:p>
@@ -1169,23 +1189,43 @@
           <w:color w:val="A63030"/>
           <w:sz w:val="19"/>
         </w:rPr>
-        <w:t>Figura 2. Ejecucion fallida del flujo (build rojo)</w:t>
+        <w:t>Figura 2. Ejecución fallida del flujo (build rojo)</w:t>
       </w:r>
     </w:p>
     <w:p>
-      <w:pPr>
-        <w:spacing w:before="0" w:after="40" w:line="240" w:lineRule="auto"/>
-        <w:jc w:val="center"/>
-      </w:pPr>
       <w:r>
-        <w:rPr>
-          <w:rFonts w:ascii="Times New Roman" w:hAnsi="Times New Roman"/>
-          <w:b w:val="0"/>
-          <w:i/>
-          <w:color w:val="A63030"/>
-          <w:sz w:val="19"/>
-        </w:rPr>
-        <w:t>Pendiente insertar captura: github_actions_failure.png</w:t>
+        <w:drawing>
+          <wp:inline xmlns:a="http://schemas.openxmlformats.org/drawingml/2006/main" xmlns:pic="http://schemas.openxmlformats.org/drawingml/2006/picture">
+            <wp:extent cx="6172200" cy="4571820"/>
+            <wp:docPr id="2" name="Picture 2"/>
+            <wp:cNvGraphicFramePr>
+              <a:graphicFrameLocks noChangeAspect="1"/>
+            </wp:cNvGraphicFramePr>
+            <a:graphic>
+              <a:graphicData uri="http://schemas.openxmlformats.org/drawingml/2006/picture">
+                <pic:pic>
+                  <pic:nvPicPr>
+                    <pic:cNvPr id="0" name="github_actions_failure.png"/>
+                    <pic:cNvPicPr/>
+                  </pic:nvPicPr>
+                  <pic:blipFill>
+                    <a:blip r:embed="rId10"/>
+                    <a:stretch>
+                      <a:fillRect/>
+                    </a:stretch>
+                  </pic:blipFill>
+                  <pic:spPr>
+                    <a:xfrm>
+                      <a:off x="0" y="0"/>
+                      <a:ext cx="6172200" cy="4571820"/>
+                    </a:xfrm>
+                    <a:prstGeom prst="rect"/>
+                  </pic:spPr>
+                </pic:pic>
+              </a:graphicData>
+            </a:graphic>
+          </wp:inline>
+        </w:drawing>
       </w:r>
     </w:p>
     <w:p>
@@ -1200,7 +1240,7 @@
           <w:color w:val="586069"/>
           <w:sz w:val="16"/>
         </w:rPr>
-        <w:t>Nota. Se rompio una prueba de forma intencional para demostrar que GitHub Actions detecta el fallo.</w:t>
+        <w:t>Nota. Se rompió una prueba de forma intencional para demostrar que GitHub Actions detecta el fallo.</w:t>
       </w:r>
     </w:p>
     <w:p>
@@ -1231,7 +1271,7 @@
           <w:color w:val="141E2D"/>
           <w:sz w:val="20"/>
         </w:rPr>
-        <w:t>El repositorio final queda publico, con el workflow de GitHub Actions en .github/workflows/ci.yml y ejecucion automatica ante cada push o pull request. El archivo server/.env no se publica; solo se incluye server/.env.example para documentar las variables necesarias sin exponer la API privada.</w:t>
+        <w:t>El repositorio final queda público, con el workflow de GitHub Actions en .github/workflows/ci.yml y ejecución automática ante cada push o pull request. El archivo server/.env no se publica; solo se incluye server/.env.example para documentar las variables necesarias sin exponer la API privada.</w:t>
       </w:r>
     </w:p>
     <w:sectPr>

</xml_diff>